<commit_message>
New text is added
</commit_message>
<xml_diff>
--- a/T16.docx
+++ b/T16.docx
@@ -21,6 +21,21 @@
         <w:t xml:space="preserve"> lab task for the final term</w:t>
       </w:r>
     </w:p>
+    <w:p>
+      <w:r>
+        <w:t>Now I am giving 2</w:t>
+      </w:r>
+      <w:r>
+        <w:rPr>
+          <w:vertAlign w:val="superscript"/>
+        </w:rPr>
+        <w:t>nd</w:t>
+      </w:r>
+      <w:r>
+        <w:t xml:space="preserve"> release.</w:t>
+      </w:r>
+    </w:p>
+    <w:p/>
     <w:sectPr>
       <w:pgSz w:w="12240" w:h="15840"/>
       <w:pgMar w:top="1440" w:right="1440" w:bottom="1440" w:left="1440" w:header="720" w:footer="720" w:gutter="0"/>

</xml_diff>